<commit_message>
docs: DNS instructions updated with real Railway-minted values
Both domains registered on Railway via CLI (saxansaxo.kuja.org ->
hot7641h.up.railway.app, sclr.kuja.org -> kqabm7uk.up.railway.app)
with single-prefix TXT verification values. Root cause of the
Proximate 4-day DNS outage identified: Railway CLI prints the TXT
value with a DOUBLED railway-verify= prefix (display bug) — doc now
warns explicitly and carries the corrected values.

Co-Authored-By: Claude Fable 5 <noreply@anthropic.com>
</commit_message>
<xml_diff>
--- a/docs/Saxansaxo_Domain_DNS_Instructions_July2026.docx
+++ b/docs/Saxansaxo_Domain_DNS_Instructions_July2026.docx
@@ -93,7 +93,7 @@
           <w:sz w:val="28"/>
           <w:szCs w:val="28"/>
         </w:rPr>
-        <w:t xml:space="preserve">Current status</w:t>
+        <w:t xml:space="preserve">Current status — 21 July 2026</w:t>
       </w:r>
     </w:p>
     <w:p>
@@ -144,16 +144,16 @@
           <w:sz w:val="21"/>
           <w:szCs w:val="21"/>
         </w:rPr>
-        <w:t xml:space="preserve">NEXT — Step A (Railway registration): </w:t>
-      </w:r>
-      <w:r>
-        <w:rPr>
-          <w:rFonts w:ascii="Arial" w:cs="Arial" w:eastAsia="Arial" w:hAnsi="Arial"/>
-          <w:color w:val="1A1410"/>
-          <w:sz w:val="21"/>
-          <w:szCs w:val="21"/>
-        </w:rPr>
-        <w:t xml:space="preserve">needs someone with Railway dashboard access (Idiris). This mints the DNS values.</w:t>
+        <w:t xml:space="preserve">DONE — Railway registration: </w:t>
+      </w:r>
+      <w:r>
+        <w:rPr>
+          <w:rFonts w:ascii="Arial" w:cs="Arial" w:eastAsia="Arial" w:hAnsi="Arial"/>
+          <w:color w:val="1A1410"/>
+          <w:sz w:val="21"/>
+          <w:szCs w:val="21"/>
+        </w:rPr>
+        <w:t xml:space="preserve">both domains are registered on the web service. The exact DNS values are in the table below — nothing left to look up.</w:t>
       </w:r>
     </w:p>
     <w:p>
@@ -174,16 +174,16 @@
           <w:sz w:val="21"/>
           <w:szCs w:val="21"/>
         </w:rPr>
-        <w:t xml:space="preserve">THEN — Step B (DNS records): </w:t>
-      </w:r>
-      <w:r>
-        <w:rPr>
-          <w:rFonts w:ascii="Arial" w:cs="Arial" w:eastAsia="Arial" w:hAnsi="Arial"/>
-          <w:color w:val="1A1410"/>
-          <w:sz w:val="21"/>
-          <w:szCs w:val="21"/>
-        </w:rPr>
-        <w:t xml:space="preserve">IT creates the records below with the minted values.</w:t>
+        <w:t xml:space="preserve">REMAINING — IT: </w:t>
+      </w:r>
+      <w:r>
+        <w:rPr>
+          <w:rFonts w:ascii="Arial" w:cs="Arial" w:eastAsia="Arial" w:hAnsi="Arial"/>
+          <w:color w:val="1A1410"/>
+          <w:sz w:val="21"/>
+          <w:szCs w:val="21"/>
+        </w:rPr>
+        <w:t xml:space="preserve">create the four DNS records below at the kuja.org DNS host. Railway then verifies and issues certificates automatically.</w:t>
       </w:r>
     </w:p>
     <w:p>
@@ -230,223 +230,7 @@
           <w:sz w:val="28"/>
           <w:szCs w:val="28"/>
         </w:rPr>
-        <w:t xml:space="preserve">Step A — Register the domains on Railway (Idiris, ~5 min)</w:t>
-      </w:r>
-    </w:p>
-    <w:p>
-      <w:pPr>
-        <w:pStyle w:val="ListParagraph"/>
-        <w:numPr>
-          <w:ilvl w:val="0"/>
-          <w:numId w:val="3"/>
-        </w:numPr>
-        <w:spacing w:after="50" w:before="50"/>
-      </w:pPr>
-      <w:r>
-        <w:rPr>
-          <w:rFonts w:ascii="Arial" w:cs="Arial" w:eastAsia="Arial" w:hAnsi="Arial"/>
-          <w:color w:val="1A1410"/>
-          <w:sz w:val="21"/>
-          <w:szCs w:val="21"/>
-        </w:rPr>
-        <w:t xml:space="preserve">Open the Railway dashboard → project </w:t>
-      </w:r>
-      <w:r>
-        <w:rPr>
-          <w:rFonts w:ascii="Arial" w:cs="Arial" w:eastAsia="Arial" w:hAnsi="Arial"/>
-          <w:b/>
-          <w:bCs/>
-          <w:color w:val="1A1410"/>
-          <w:sz w:val="21"/>
-          <w:szCs w:val="21"/>
-        </w:rPr>
-        <w:t xml:space="preserve">clever-cooperation</w:t>
-      </w:r>
-      <w:r>
-        <w:rPr>
-          <w:rFonts w:ascii="Arial" w:cs="Arial" w:eastAsia="Arial" w:hAnsi="Arial"/>
-          <w:color w:val="1A1410"/>
-          <w:sz w:val="21"/>
-          <w:szCs w:val="21"/>
-        </w:rPr>
-        <w:t xml:space="preserve"> → service </w:t>
-      </w:r>
-      <w:r>
-        <w:rPr>
-          <w:rFonts w:ascii="Arial" w:cs="Arial" w:eastAsia="Arial" w:hAnsi="Arial"/>
-          <w:b/>
-          <w:bCs/>
-          <w:color w:val="1A1410"/>
-          <w:sz w:val="21"/>
-          <w:szCs w:val="21"/>
-        </w:rPr>
-        <w:t xml:space="preserve">web</w:t>
-      </w:r>
-      <w:r>
-        <w:rPr>
-          <w:rFonts w:ascii="Arial" w:cs="Arial" w:eastAsia="Arial" w:hAnsi="Arial"/>
-          <w:color w:val="1A1410"/>
-          <w:sz w:val="21"/>
-          <w:szCs w:val="21"/>
-        </w:rPr>
-        <w:t xml:space="preserve"> → Settings → Networking (Custom Domains).</w:t>
-      </w:r>
-    </w:p>
-    <w:p>
-      <w:pPr>
-        <w:pStyle w:val="ListParagraph"/>
-        <w:numPr>
-          <w:ilvl w:val="0"/>
-          <w:numId w:val="3"/>
-        </w:numPr>
-        <w:spacing w:after="50" w:before="50"/>
-      </w:pPr>
-      <w:r>
-        <w:rPr>
-          <w:rFonts w:ascii="Arial" w:cs="Arial" w:eastAsia="Arial" w:hAnsi="Arial"/>
-          <w:color w:val="1A1410"/>
-          <w:sz w:val="21"/>
-          <w:szCs w:val="21"/>
-        </w:rPr>
-        <w:t xml:space="preserve">Click </w:t>
-      </w:r>
-      <w:r>
-        <w:rPr>
-          <w:rFonts w:ascii="Arial" w:cs="Arial" w:eastAsia="Arial" w:hAnsi="Arial"/>
-          <w:b/>
-          <w:bCs/>
-          <w:color w:val="1A1410"/>
-          <w:sz w:val="21"/>
-          <w:szCs w:val="21"/>
-        </w:rPr>
-        <w:t xml:space="preserve">+ Custom Domain</w:t>
-      </w:r>
-      <w:r>
-        <w:rPr>
-          <w:rFonts w:ascii="Arial" w:cs="Arial" w:eastAsia="Arial" w:hAnsi="Arial"/>
-          <w:color w:val="1A1410"/>
-          <w:sz w:val="21"/>
-          <w:szCs w:val="21"/>
-        </w:rPr>
-        <w:t xml:space="preserve"> and enter </w:t>
-      </w:r>
-      <w:r>
-        <w:rPr>
-          <w:rFonts w:ascii="Arial" w:cs="Arial" w:eastAsia="Arial" w:hAnsi="Arial"/>
-          <w:b/>
-          <w:bCs/>
-          <w:color w:val="1A1410"/>
-          <w:sz w:val="21"/>
-          <w:szCs w:val="21"/>
-        </w:rPr>
-        <w:t xml:space="preserve">saxansaxo.kuja.org</w:t>
-      </w:r>
-      <w:r>
-        <w:rPr>
-          <w:rFonts w:ascii="Arial" w:cs="Arial" w:eastAsia="Arial" w:hAnsi="Arial"/>
-          <w:color w:val="1A1410"/>
-          <w:sz w:val="21"/>
-          <w:szCs w:val="21"/>
-        </w:rPr>
-        <w:t xml:space="preserve">. Railway will display the DNS records it requires — a CNAME target (something like </w:t>
-      </w:r>
-      <w:r>
-        <w:rPr>
-          <w:rFonts w:ascii="Arial" w:cs="Arial" w:eastAsia="Arial" w:hAnsi="Arial"/>
-          <w:i/>
-          <w:iCs/>
-          <w:color w:val="1A1410"/>
-          <w:sz w:val="21"/>
-          <w:szCs w:val="21"/>
-        </w:rPr>
-        <w:t xml:space="preserve">xxxxxxxx.up.railway.app</w:t>
-      </w:r>
-      <w:r>
-        <w:rPr>
-          <w:rFonts w:ascii="Arial" w:cs="Arial" w:eastAsia="Arial" w:hAnsi="Arial"/>
-          <w:color w:val="1A1410"/>
-          <w:sz w:val="21"/>
-          <w:szCs w:val="21"/>
-        </w:rPr>
-        <w:t xml:space="preserve">) and usually a TXT verification record with a value beginning </w:t>
-      </w:r>
-      <w:r>
-        <w:rPr>
-          <w:rFonts w:ascii="Arial" w:cs="Arial" w:eastAsia="Arial" w:hAnsi="Arial"/>
-          <w:i/>
-          <w:iCs/>
-          <w:color w:val="1A1410"/>
-          <w:sz w:val="21"/>
-          <w:szCs w:val="21"/>
-        </w:rPr>
-        <w:t xml:space="preserve">railway-verify=</w:t>
-      </w:r>
-      <w:r>
-        <w:rPr>
-          <w:rFonts w:ascii="Arial" w:cs="Arial" w:eastAsia="Arial" w:hAnsi="Arial"/>
-          <w:color w:val="1A1410"/>
-          <w:sz w:val="21"/>
-          <w:szCs w:val="21"/>
-        </w:rPr>
-        <w:t xml:space="preserve">.</w:t>
-      </w:r>
-    </w:p>
-    <w:p>
-      <w:pPr>
-        <w:pStyle w:val="ListParagraph"/>
-        <w:numPr>
-          <w:ilvl w:val="0"/>
-          <w:numId w:val="3"/>
-        </w:numPr>
-        <w:spacing w:after="50" w:before="50"/>
-      </w:pPr>
-      <w:r>
-        <w:rPr>
-          <w:rFonts w:ascii="Arial" w:cs="Arial" w:eastAsia="Arial" w:hAnsi="Arial"/>
-          <w:color w:val="1A1410"/>
-          <w:sz w:val="21"/>
-          <w:szCs w:val="21"/>
-        </w:rPr>
-        <w:t xml:space="preserve">Repeat for </w:t>
-      </w:r>
-      <w:r>
-        <w:rPr>
-          <w:rFonts w:ascii="Arial" w:cs="Arial" w:eastAsia="Arial" w:hAnsi="Arial"/>
-          <w:b/>
-          <w:bCs/>
-          <w:color w:val="1A1410"/>
-          <w:sz w:val="21"/>
-          <w:szCs w:val="21"/>
-        </w:rPr>
-        <w:t xml:space="preserve">sclr.kuja.org</w:t>
-      </w:r>
-      <w:r>
-        <w:rPr>
-          <w:rFonts w:ascii="Arial" w:cs="Arial" w:eastAsia="Arial" w:hAnsi="Arial"/>
-          <w:color w:val="1A1410"/>
-          <w:sz w:val="21"/>
-          <w:szCs w:val="21"/>
-        </w:rPr>
-        <w:t xml:space="preserve">. Each domain gets its OWN values — do not reuse one domain’s values for the other.</w:t>
-      </w:r>
-    </w:p>
-    <w:p>
-      <w:pPr>
-        <w:pStyle w:val="ListParagraph"/>
-        <w:numPr>
-          <w:ilvl w:val="0"/>
-          <w:numId w:val="3"/>
-        </w:numPr>
-        <w:spacing w:after="50" w:before="50"/>
-      </w:pPr>
-      <w:r>
-        <w:rPr>
-          <w:rFonts w:ascii="Arial" w:cs="Arial" w:eastAsia="Arial" w:hAnsi="Arial"/>
-          <w:color w:val="1A1410"/>
-          <w:sz w:val="21"/>
-          <w:szCs w:val="21"/>
-        </w:rPr>
-        <w:t xml:space="preserve">Copy the exact values shown for both domains (screenshot is fine) and send them to IT with this document.</w:t>
+        <w:t xml:space="preserve">The DNS records to create (IT, at the kuja.org DNS host)</w:t>
       </w:r>
     </w:p>
     <w:p>
@@ -456,44 +240,11 @@
       <w:r>
         <w:rPr>
           <w:rFonts w:ascii="Arial" w:cs="Arial" w:eastAsia="Arial" w:hAnsi="Arial"/>
-          <w:i/>
-          <w:iCs/>
-          <w:color w:val="6B655F"/>
-          <w:sz w:val="21"/>
-          <w:szCs w:val="21"/>
-        </w:rPr>
-        <w:t xml:space="preserve">Note: the plan-limit banner that sometimes shows on this screen was a red herring last time — it does not block adding these domains.</w:t>
-      </w:r>
-    </w:p>
-    <w:p>
-      <w:pPr>
-        <w:pStyle w:val="Heading1"/>
-        <w:spacing w:after="120" w:before="300"/>
-      </w:pPr>
-      <w:r>
-        <w:rPr>
-          <w:rFonts w:ascii="Arial" w:cs="Arial" w:eastAsia="Arial" w:hAnsi="Arial"/>
-          <w:b/>
-          <w:bCs/>
-          <w:color w:val="7C2D12"/>
-          <w:sz w:val="28"/>
-          <w:szCs w:val="28"/>
-        </w:rPr>
-        <w:t xml:space="preserve">Step B — Create the DNS records (IT, at the kuja.org DNS host)</w:t>
-      </w:r>
-    </w:p>
-    <w:p>
-      <w:pPr>
-        <w:spacing w:after="80" w:before="80"/>
-      </w:pPr>
-      <w:r>
-        <w:rPr>
-          <w:rFonts w:ascii="Arial" w:cs="Arial" w:eastAsia="Arial" w:hAnsi="Arial"/>
-          <w:color w:val="1A1410"/>
-          <w:sz w:val="21"/>
-          <w:szCs w:val="21"/>
-        </w:rPr>
-        <w:t xml:space="preserve">Create these four records, filling the value column from Step A:</w:t>
+          <w:color w:val="1A1410"/>
+          <w:sz w:val="21"/>
+          <w:szCs w:val="21"/>
+        </w:rPr>
+        <w:t xml:space="preserve">These are the exact, final values — minted by Railway on 21 July 2026. Create all four records:</w:t>
       </w:r>
     </w:p>
     <w:tbl>
@@ -509,10 +260,10 @@
         </w:tblBorders>
       </w:tblPr>
       <w:tblGrid>
+        <w:gridCol w:w="900"/>
+        <w:gridCol w:w="2700"/>
+        <w:gridCol w:w="4760"/>
         <w:gridCol w:w="1000"/>
-        <w:gridCol w:w="3300"/>
-        <w:gridCol w:w="3860"/>
-        <w:gridCol w:w="1200"/>
       </w:tblGrid>
       <w:tr>
         <w:trPr>
@@ -520,7 +271,7 @@
         </w:trPr>
         <w:tc>
           <w:tcPr>
-            <w:tcW w:type="dxa" w:w="1000"/>
+            <w:tcW w:type="dxa" w:w="900"/>
             <w:tcBorders>
               <w:top w:val="single" w:color="CCCCCC" w:sz="1"/>
               <w:left w:val="single" w:color="CCCCCC" w:sz="1"/>
@@ -554,7 +305,7 @@
         </w:tc>
         <w:tc>
           <w:tcPr>
-            <w:tcW w:type="dxa" w:w="3300"/>
+            <w:tcW w:type="dxa" w:w="2700"/>
             <w:tcBorders>
               <w:top w:val="single" w:color="CCCCCC" w:sz="1"/>
               <w:left w:val="single" w:color="CCCCCC" w:sz="1"/>
@@ -588,7 +339,7 @@
         </w:tc>
         <w:tc>
           <w:tcPr>
-            <w:tcW w:type="dxa" w:w="3860"/>
+            <w:tcW w:type="dxa" w:w="4760"/>
             <w:tcBorders>
               <w:top w:val="single" w:color="CCCCCC" w:sz="1"/>
               <w:left w:val="single" w:color="CCCCCC" w:sz="1"/>
@@ -622,7 +373,7 @@
         </w:tc>
         <w:tc>
           <w:tcPr>
-            <w:tcW w:type="dxa" w:w="1200"/>
+            <w:tcW w:type="dxa" w:w="1000"/>
             <w:tcBorders>
               <w:top w:val="single" w:color="CCCCCC" w:sz="1"/>
               <w:left w:val="single" w:color="CCCCCC" w:sz="1"/>
@@ -658,7 +409,7 @@
       <w:tr>
         <w:tc>
           <w:tcPr>
-            <w:tcW w:type="dxa" w:w="1000"/>
+            <w:tcW w:type="dxa" w:w="900"/>
             <w:tcBorders>
               <w:top w:val="single" w:color="CCCCCC" w:sz="1"/>
               <w:left w:val="single" w:color="CCCCCC" w:sz="1"/>
@@ -691,7 +442,7 @@
         </w:tc>
         <w:tc>
           <w:tcPr>
-            <w:tcW w:type="dxa" w:w="3300"/>
+            <w:tcW w:type="dxa" w:w="2700"/>
             <w:tcBorders>
               <w:top w:val="single" w:color="CCCCCC" w:sz="1"/>
               <w:left w:val="single" w:color="CCCCCC" w:sz="1"/>
@@ -722,7 +473,38 @@
         </w:tc>
         <w:tc>
           <w:tcPr>
-            <w:tcW w:type="dxa" w:w="3860"/>
+            <w:tcW w:type="dxa" w:w="4760"/>
+            <w:tcBorders>
+              <w:top w:val="single" w:color="CCCCCC" w:sz="1"/>
+              <w:left w:val="single" w:color="CCCCCC" w:sz="1"/>
+              <w:bottom w:val="single" w:color="CCCCCC" w:sz="1"/>
+              <w:right w:val="single" w:color="CCCCCC" w:sz="1"/>
+            </w:tcBorders>
+            <w:tcMar>
+              <w:top w:type="dxa" w:w="60"/>
+              <w:left w:type="dxa" w:w="100"/>
+              <w:bottom w:type="dxa" w:w="60"/>
+              <w:right w:type="dxa" w:w="100"/>
+            </w:tcMar>
+          </w:tcPr>
+          <w:p>
+            <w:pPr>
+              <w:spacing w:after="20" w:before="20"/>
+            </w:pPr>
+            <w:r>
+              <w:rPr>
+                <w:rFonts w:ascii="Consolas" w:cs="Consolas" w:eastAsia="Consolas" w:hAnsi="Consolas"/>
+                <w:color w:val="1A1410"/>
+                <w:sz w:val="19"/>
+                <w:szCs w:val="19"/>
+              </w:rPr>
+              <w:t xml:space="preserve">hot7641h.up.railway.app</w:t>
+            </w:r>
+          </w:p>
+        </w:tc>
+        <w:tc>
+          <w:tcPr>
+            <w:tcW w:type="dxa" w:w="1000"/>
             <w:tcBorders>
               <w:top w:val="single" w:color="CCCCCC" w:sz="1"/>
               <w:left w:val="single" w:color="CCCCCC" w:sz="1"/>
@@ -747,38 +529,7 @@
                 <w:sz w:val="19"/>
                 <w:szCs w:val="19"/>
               </w:rPr>
-              <w:t xml:space="preserve">&lt;CNAME target Railway shows for saxansaxo.kuja.org&gt;</w:t>
-            </w:r>
-          </w:p>
-        </w:tc>
-        <w:tc>
-          <w:tcPr>
-            <w:tcW w:type="dxa" w:w="1200"/>
-            <w:tcBorders>
-              <w:top w:val="single" w:color="CCCCCC" w:sz="1"/>
-              <w:left w:val="single" w:color="CCCCCC" w:sz="1"/>
-              <w:bottom w:val="single" w:color="CCCCCC" w:sz="1"/>
-              <w:right w:val="single" w:color="CCCCCC" w:sz="1"/>
-            </w:tcBorders>
-            <w:tcMar>
-              <w:top w:type="dxa" w:w="60"/>
-              <w:left w:type="dxa" w:w="100"/>
-              <w:bottom w:type="dxa" w:w="60"/>
-              <w:right w:type="dxa" w:w="100"/>
-            </w:tcMar>
-          </w:tcPr>
-          <w:p>
-            <w:pPr>
-              <w:spacing w:after="20" w:before="20"/>
-            </w:pPr>
-            <w:r>
-              <w:rPr>
-                <w:rFonts w:ascii="Arial" w:cs="Arial" w:eastAsia="Arial" w:hAnsi="Arial"/>
-                <w:color w:val="1A1410"/>
-                <w:sz w:val="19"/>
-                <w:szCs w:val="19"/>
-              </w:rPr>
-              <w:t xml:space="preserve">300 / Auto</w:t>
+              <w:t xml:space="preserve">300</w:t>
             </w:r>
           </w:p>
         </w:tc>
@@ -786,7 +537,7 @@
       <w:tr>
         <w:tc>
           <w:tcPr>
-            <w:tcW w:type="dxa" w:w="1000"/>
+            <w:tcW w:type="dxa" w:w="900"/>
             <w:tcBorders>
               <w:top w:val="single" w:color="CCCCCC" w:sz="1"/>
               <w:left w:val="single" w:color="CCCCCC" w:sz="1"/>
@@ -819,7 +570,7 @@
         </w:tc>
         <w:tc>
           <w:tcPr>
-            <w:tcW w:type="dxa" w:w="3300"/>
+            <w:tcW w:type="dxa" w:w="2700"/>
             <w:tcBorders>
               <w:top w:val="single" w:color="CCCCCC" w:sz="1"/>
               <w:left w:val="single" w:color="CCCCCC" w:sz="1"/>
@@ -850,7 +601,38 @@
         </w:tc>
         <w:tc>
           <w:tcPr>
-            <w:tcW w:type="dxa" w:w="3860"/>
+            <w:tcW w:type="dxa" w:w="4760"/>
+            <w:tcBorders>
+              <w:top w:val="single" w:color="CCCCCC" w:sz="1"/>
+              <w:left w:val="single" w:color="CCCCCC" w:sz="1"/>
+              <w:bottom w:val="single" w:color="CCCCCC" w:sz="1"/>
+              <w:right w:val="single" w:color="CCCCCC" w:sz="1"/>
+            </w:tcBorders>
+            <w:tcMar>
+              <w:top w:type="dxa" w:w="60"/>
+              <w:left w:type="dxa" w:w="100"/>
+              <w:bottom w:type="dxa" w:w="60"/>
+              <w:right w:type="dxa" w:w="100"/>
+            </w:tcMar>
+          </w:tcPr>
+          <w:p>
+            <w:pPr>
+              <w:spacing w:after="20" w:before="20"/>
+            </w:pPr>
+            <w:r>
+              <w:rPr>
+                <w:rFonts w:ascii="Consolas" w:cs="Consolas" w:eastAsia="Consolas" w:hAnsi="Consolas"/>
+                <w:color w:val="1A1410"/>
+                <w:sz w:val="19"/>
+                <w:szCs w:val="19"/>
+              </w:rPr>
+              <w:t xml:space="preserve">railway-verify=659b2528c662a41d2515d47ef4f545d1847232b4c6de850827fc1cd4a34d41f2</w:t>
+            </w:r>
+          </w:p>
+        </w:tc>
+        <w:tc>
+          <w:tcPr>
+            <w:tcW w:type="dxa" w:w="1000"/>
             <w:tcBorders>
               <w:top w:val="single" w:color="CCCCCC" w:sz="1"/>
               <w:left w:val="single" w:color="CCCCCC" w:sz="1"/>
@@ -875,38 +657,7 @@
                 <w:sz w:val="19"/>
                 <w:szCs w:val="19"/>
               </w:rPr>
-              <w:t xml:space="preserve">&lt;exact TXT value Railway shows — starts railway-verify=&gt;</w:t>
-            </w:r>
-          </w:p>
-        </w:tc>
-        <w:tc>
-          <w:tcPr>
-            <w:tcW w:type="dxa" w:w="1200"/>
-            <w:tcBorders>
-              <w:top w:val="single" w:color="CCCCCC" w:sz="1"/>
-              <w:left w:val="single" w:color="CCCCCC" w:sz="1"/>
-              <w:bottom w:val="single" w:color="CCCCCC" w:sz="1"/>
-              <w:right w:val="single" w:color="CCCCCC" w:sz="1"/>
-            </w:tcBorders>
-            <w:tcMar>
-              <w:top w:type="dxa" w:w="60"/>
-              <w:left w:type="dxa" w:w="100"/>
-              <w:bottom w:type="dxa" w:w="60"/>
-              <w:right w:type="dxa" w:w="100"/>
-            </w:tcMar>
-          </w:tcPr>
-          <w:p>
-            <w:pPr>
-              <w:spacing w:after="20" w:before="20"/>
-            </w:pPr>
-            <w:r>
-              <w:rPr>
-                <w:rFonts w:ascii="Arial" w:cs="Arial" w:eastAsia="Arial" w:hAnsi="Arial"/>
-                <w:color w:val="1A1410"/>
-                <w:sz w:val="19"/>
-                <w:szCs w:val="19"/>
-              </w:rPr>
-              <w:t xml:space="preserve">300 / Auto</w:t>
+              <w:t xml:space="preserve">300</w:t>
             </w:r>
           </w:p>
         </w:tc>
@@ -914,7 +665,7 @@
       <w:tr>
         <w:tc>
           <w:tcPr>
-            <w:tcW w:type="dxa" w:w="1000"/>
+            <w:tcW w:type="dxa" w:w="900"/>
             <w:tcBorders>
               <w:top w:val="single" w:color="CCCCCC" w:sz="1"/>
               <w:left w:val="single" w:color="CCCCCC" w:sz="1"/>
@@ -947,7 +698,7 @@
         </w:tc>
         <w:tc>
           <w:tcPr>
-            <w:tcW w:type="dxa" w:w="3300"/>
+            <w:tcW w:type="dxa" w:w="2700"/>
             <w:tcBorders>
               <w:top w:val="single" w:color="CCCCCC" w:sz="1"/>
               <w:left w:val="single" w:color="CCCCCC" w:sz="1"/>
@@ -978,7 +729,38 @@
         </w:tc>
         <w:tc>
           <w:tcPr>
-            <w:tcW w:type="dxa" w:w="3860"/>
+            <w:tcW w:type="dxa" w:w="4760"/>
+            <w:tcBorders>
+              <w:top w:val="single" w:color="CCCCCC" w:sz="1"/>
+              <w:left w:val="single" w:color="CCCCCC" w:sz="1"/>
+              <w:bottom w:val="single" w:color="CCCCCC" w:sz="1"/>
+              <w:right w:val="single" w:color="CCCCCC" w:sz="1"/>
+            </w:tcBorders>
+            <w:tcMar>
+              <w:top w:type="dxa" w:w="60"/>
+              <w:left w:type="dxa" w:w="100"/>
+              <w:bottom w:type="dxa" w:w="60"/>
+              <w:right w:type="dxa" w:w="100"/>
+            </w:tcMar>
+          </w:tcPr>
+          <w:p>
+            <w:pPr>
+              <w:spacing w:after="20" w:before="20"/>
+            </w:pPr>
+            <w:r>
+              <w:rPr>
+                <w:rFonts w:ascii="Consolas" w:cs="Consolas" w:eastAsia="Consolas" w:hAnsi="Consolas"/>
+                <w:color w:val="1A1410"/>
+                <w:sz w:val="19"/>
+                <w:szCs w:val="19"/>
+              </w:rPr>
+              <w:t xml:space="preserve">kqabm7uk.up.railway.app</w:t>
+            </w:r>
+          </w:p>
+        </w:tc>
+        <w:tc>
+          <w:tcPr>
+            <w:tcW w:type="dxa" w:w="1000"/>
             <w:tcBorders>
               <w:top w:val="single" w:color="CCCCCC" w:sz="1"/>
               <w:left w:val="single" w:color="CCCCCC" w:sz="1"/>
@@ -1003,38 +785,7 @@
                 <w:sz w:val="19"/>
                 <w:szCs w:val="19"/>
               </w:rPr>
-              <w:t xml:space="preserve">&lt;CNAME target Railway shows for sclr.kuja.org&gt;</w:t>
-            </w:r>
-          </w:p>
-        </w:tc>
-        <w:tc>
-          <w:tcPr>
-            <w:tcW w:type="dxa" w:w="1200"/>
-            <w:tcBorders>
-              <w:top w:val="single" w:color="CCCCCC" w:sz="1"/>
-              <w:left w:val="single" w:color="CCCCCC" w:sz="1"/>
-              <w:bottom w:val="single" w:color="CCCCCC" w:sz="1"/>
-              <w:right w:val="single" w:color="CCCCCC" w:sz="1"/>
-            </w:tcBorders>
-            <w:tcMar>
-              <w:top w:type="dxa" w:w="60"/>
-              <w:left w:type="dxa" w:w="100"/>
-              <w:bottom w:type="dxa" w:w="60"/>
-              <w:right w:type="dxa" w:w="100"/>
-            </w:tcMar>
-          </w:tcPr>
-          <w:p>
-            <w:pPr>
-              <w:spacing w:after="20" w:before="20"/>
-            </w:pPr>
-            <w:r>
-              <w:rPr>
-                <w:rFonts w:ascii="Arial" w:cs="Arial" w:eastAsia="Arial" w:hAnsi="Arial"/>
-                <w:color w:val="1A1410"/>
-                <w:sz w:val="19"/>
-                <w:szCs w:val="19"/>
-              </w:rPr>
-              <w:t xml:space="preserve">300 / Auto</w:t>
+              <w:t xml:space="preserve">300</w:t>
             </w:r>
           </w:p>
         </w:tc>
@@ -1042,7 +793,7 @@
       <w:tr>
         <w:tc>
           <w:tcPr>
-            <w:tcW w:type="dxa" w:w="1000"/>
+            <w:tcW w:type="dxa" w:w="900"/>
             <w:tcBorders>
               <w:top w:val="single" w:color="CCCCCC" w:sz="1"/>
               <w:left w:val="single" w:color="CCCCCC" w:sz="1"/>
@@ -1075,7 +826,7 @@
         </w:tc>
         <w:tc>
           <w:tcPr>
-            <w:tcW w:type="dxa" w:w="3300"/>
+            <w:tcW w:type="dxa" w:w="2700"/>
             <w:tcBorders>
               <w:top w:val="single" w:color="CCCCCC" w:sz="1"/>
               <w:left w:val="single" w:color="CCCCCC" w:sz="1"/>
@@ -1106,7 +857,38 @@
         </w:tc>
         <w:tc>
           <w:tcPr>
-            <w:tcW w:type="dxa" w:w="3860"/>
+            <w:tcW w:type="dxa" w:w="4760"/>
+            <w:tcBorders>
+              <w:top w:val="single" w:color="CCCCCC" w:sz="1"/>
+              <w:left w:val="single" w:color="CCCCCC" w:sz="1"/>
+              <w:bottom w:val="single" w:color="CCCCCC" w:sz="1"/>
+              <w:right w:val="single" w:color="CCCCCC" w:sz="1"/>
+            </w:tcBorders>
+            <w:tcMar>
+              <w:top w:type="dxa" w:w="60"/>
+              <w:left w:type="dxa" w:w="100"/>
+              <w:bottom w:type="dxa" w:w="60"/>
+              <w:right w:type="dxa" w:w="100"/>
+            </w:tcMar>
+          </w:tcPr>
+          <w:p>
+            <w:pPr>
+              <w:spacing w:after="20" w:before="20"/>
+            </w:pPr>
+            <w:r>
+              <w:rPr>
+                <w:rFonts w:ascii="Consolas" w:cs="Consolas" w:eastAsia="Consolas" w:hAnsi="Consolas"/>
+                <w:color w:val="1A1410"/>
+                <w:sz w:val="19"/>
+                <w:szCs w:val="19"/>
+              </w:rPr>
+              <w:t xml:space="preserve">railway-verify=12f9e13c517109d5f91125d5ff69853bfa0cb7542ce4caa2ad21bdafc16a1d4c</w:t>
+            </w:r>
+          </w:p>
+        </w:tc>
+        <w:tc>
+          <w:tcPr>
+            <w:tcW w:type="dxa" w:w="1000"/>
             <w:tcBorders>
               <w:top w:val="single" w:color="CCCCCC" w:sz="1"/>
               <w:left w:val="single" w:color="CCCCCC" w:sz="1"/>
@@ -1131,38 +913,7 @@
                 <w:sz w:val="19"/>
                 <w:szCs w:val="19"/>
               </w:rPr>
-              <w:t xml:space="preserve">&lt;exact TXT value Railway shows — starts railway-verify=&gt;</w:t>
-            </w:r>
-          </w:p>
-        </w:tc>
-        <w:tc>
-          <w:tcPr>
-            <w:tcW w:type="dxa" w:w="1200"/>
-            <w:tcBorders>
-              <w:top w:val="single" w:color="CCCCCC" w:sz="1"/>
-              <w:left w:val="single" w:color="CCCCCC" w:sz="1"/>
-              <w:bottom w:val="single" w:color="CCCCCC" w:sz="1"/>
-              <w:right w:val="single" w:color="CCCCCC" w:sz="1"/>
-            </w:tcBorders>
-            <w:tcMar>
-              <w:top w:type="dxa" w:w="60"/>
-              <w:left w:type="dxa" w:w="100"/>
-              <w:bottom w:type="dxa" w:w="60"/>
-              <w:right w:type="dxa" w:w="100"/>
-            </w:tcMar>
-          </w:tcPr>
-          <w:p>
-            <w:pPr>
-              <w:spacing w:after="20" w:before="20"/>
-            </w:pPr>
-            <w:r>
-              <w:rPr>
-                <w:rFonts w:ascii="Arial" w:cs="Arial" w:eastAsia="Arial" w:hAnsi="Arial"/>
-                <w:color w:val="1A1410"/>
-                <w:sz w:val="19"/>
-                <w:szCs w:val="19"/>
-              </w:rPr>
-              <w:t xml:space="preserve">300 / Auto</w:t>
+              <w:t xml:space="preserve">300</w:t>
             </w:r>
           </w:p>
         </w:tc>
@@ -1202,16 +953,16 @@
           <w:sz w:val="21"/>
           <w:szCs w:val="21"/>
         </w:rPr>
-        <w:t xml:space="preserve">Trap 1 — the doubled prefix. </w:t>
-      </w:r>
-      <w:r>
-        <w:rPr>
-          <w:rFonts w:ascii="Arial" w:cs="Arial" w:eastAsia="Arial" w:hAnsi="Arial"/>
-          <w:color w:val="1A1410"/>
-          <w:sz w:val="21"/>
-          <w:szCs w:val="21"/>
-        </w:rPr>
-        <w:t xml:space="preserve">The TXT value must be the string Railway shows, pasted ONCE. Last time the record was saved as "railway-verify=railway-verify=…" (a copy-paste slip: the DNS console field already implied the prefix). Railway’s check is exact-match, so it failed silently while a quick nslookup "looked fine". After saving, read the record back character-by-character.</w:t>
+        <w:t xml:space="preserve">Trap 1 — the doubled prefix (now explained!). </w:t>
+      </w:r>
+      <w:r>
+        <w:rPr>
+          <w:rFonts w:ascii="Arial" w:cs="Arial" w:eastAsia="Arial" w:hAnsi="Arial"/>
+          <w:color w:val="1A1410"/>
+          <w:sz w:val="21"/>
+          <w:szCs w:val="21"/>
+        </w:rPr>
+        <w:t xml:space="preserve">Railway’s own CLI displays the TXT value with "railway-verify=" printed TWICE — that display bug is exactly what caused last time’s four-day outage. The correct record value has the prefix ONCE, as printed in the table above (railway-verify=&lt;64 hex characters&gt;). After saving, read the record back: it must contain "railway-verify=" exactly once.</w:t>
       </w:r>
     </w:p>
     <w:p>

</xml_diff>